<commit_message>
Add 3 more mock-interview cards (C/D/E) to the ALT guide
Same official format, new situations, with model answers for all four
questions per card (.docx, .html, .md kept in sync):
- Card C — Cleaning the Park (community / volunteering)
- Card D — Walking Every Day (health / exercise)
- Card E — Talking Online with Family (technology / family)
Also added model answers to Card B's No.3/No.4 and color-coded each card.

Co-Authored-By: Claude Opus 4.8 <noreply@anthropic.com>
Claude-Session: https://claude.ai/code/session_01DZk5RtVoh2AodSb88BQyHE
</commit_message>
<xml_diff>
--- a/eiken_p2plus_speaking_guide_alt_en.docx
+++ b/eiken_p2plus_speaking_guide_alt_en.docx
@@ -2603,11 +2603,6 @@
       </w:tr>
     </w:tbl>
     <w:p>
-      <w:r>
-        <w:br w:type="page"/>
-      </w:r>
-    </w:p>
-    <w:p>
       <w:pPr>
         <w:spacing w:before="240" w:after="100"/>
         <w:pBdr>
@@ -2622,7 +2617,7 @@
           <w:color w:val="185FA5"/>
           <w:sz w:val="27"/>
         </w:rPr>
-        <w:t>7 · Spare Card B — for a second run</w:t>
+        <w:t>7 · Spare Cards — for more practice runs (B–E)</w:t>
       </w:r>
     </w:p>
     <w:tbl>
@@ -2894,7 +2889,7 @@
           <w:i w:val="0"/>
           <w:sz w:val="20"/>
         </w:rPr>
-        <w:t>begin with the sentence on the card.</w:t>
+        <w:t>Begin with the sentence on the card.</w:t>
       </w:r>
     </w:p>
     <w:tbl>
@@ -2982,6 +2977,53 @@
         <w:t xml:space="preserve">  [Yes → Why? / No → Why not?]</w:t>
       </w:r>
     </w:p>
+    <w:tbl>
+      <w:tblPr>
+        <w:tblW w:type="pct" w:w="5000"/>
+        <w:tblLook w:firstColumn="1" w:firstRow="1" w:lastColumn="0" w:lastRow="0" w:noHBand="0" w:noVBand="1" w:val="04A0"/>
+      </w:tblPr>
+      <w:tblGrid>
+        <w:gridCol w:w="10092"/>
+      </w:tblGrid>
+      <w:tr>
+        <w:tc>
+          <w:tcPr>
+            <w:tcW w:type="dxa" w:w="10092"/>
+            <w:shd w:val="clear" w:color="auto" w:fill="E1F5EE"/>
+            <w:tcBorders>
+              <w:top w:val="single" w:sz="6" w:space="0" w:color="B9E3D4"/>
+              <w:bottom w:val="single" w:sz="6" w:space="0" w:color="B9E3D4"/>
+              <w:left w:val="single" w:sz="6" w:space="0" w:color="B9E3D4"/>
+              <w:right w:val="single" w:sz="6" w:space="0" w:color="B9E3D4"/>
+            </w:tcBorders>
+          </w:tcPr>
+          <w:p>
+            <w:pPr>
+              <w:spacing w:before="40" w:after="40"/>
+            </w:pPr>
+            <w:r>
+              <w:rPr>
+                <w:rFonts w:ascii="Calibri" w:hAnsi="Calibri" w:cs="Calibri" w:eastAsia="Yu Gothic"/>
+                <w:b/>
+                <w:i w:val="0"/>
+                <w:color w:val="0F6E56"/>
+                <w:sz w:val="19"/>
+              </w:rPr>
+              <w:t xml:space="preserve">➤ Model: </w:t>
+            </w:r>
+            <w:r>
+              <w:rPr>
+                <w:rFonts w:ascii="Georgia" w:hAnsi="Georgia" w:cs="Georgia" w:eastAsia="Yu Gothic"/>
+                <w:b w:val="0"/>
+                <w:i/>
+                <w:sz w:val="19"/>
+              </w:rPr>
+              <w:t>(No) "No, I don't. Many people read on smartphones now because it is convenient, and e-books are often cheaper, so fewer people will buy paper books."</w:t>
+            </w:r>
+          </w:p>
+        </w:tc>
+      </w:tr>
+    </w:tbl>
     <w:p>
       <w:pPr>
         <w:spacing w:before="60" w:after="40"/>
@@ -3017,9 +3059,1538 @@
           <w:color w:val="5F6368"/>
           <w:sz w:val="18"/>
         </w:rPr>
-        <w:t xml:space="preserve">  [Yes → Please tell me more. / No → Why not?]</w:t>
+        <w:t xml:space="preserve">  [Yes → tell me more / No → Why not?]</w:t>
       </w:r>
     </w:p>
+    <w:tbl>
+      <w:tblPr>
+        <w:tblW w:type="pct" w:w="5000"/>
+        <w:tblLook w:firstColumn="1" w:firstRow="1" w:lastColumn="0" w:lastRow="0" w:noHBand="0" w:noVBand="1" w:val="04A0"/>
+      </w:tblPr>
+      <w:tblGrid>
+        <w:gridCol w:w="10092"/>
+      </w:tblGrid>
+      <w:tr>
+        <w:tc>
+          <w:tcPr>
+            <w:tcW w:type="dxa" w:w="10092"/>
+            <w:shd w:val="clear" w:color="auto" w:fill="E1F5EE"/>
+            <w:tcBorders>
+              <w:top w:val="single" w:sz="6" w:space="0" w:color="B9E3D4"/>
+              <w:bottom w:val="single" w:sz="6" w:space="0" w:color="B9E3D4"/>
+              <w:left w:val="single" w:sz="6" w:space="0" w:color="B9E3D4"/>
+              <w:right w:val="single" w:sz="6" w:space="0" w:color="B9E3D4"/>
+            </w:tcBorders>
+          </w:tcPr>
+          <w:p>
+            <w:pPr>
+              <w:spacing w:before="40" w:after="40"/>
+            </w:pPr>
+            <w:r>
+              <w:rPr>
+                <w:rFonts w:ascii="Calibri" w:hAnsi="Calibri" w:cs="Calibri" w:eastAsia="Yu Gothic"/>
+                <w:b/>
+                <w:i w:val="0"/>
+                <w:color w:val="0F6E56"/>
+                <w:sz w:val="19"/>
+              </w:rPr>
+              <w:t xml:space="preserve">➤ Model: </w:t>
+            </w:r>
+            <w:r>
+              <w:rPr>
+                <w:rFonts w:ascii="Georgia" w:hAnsi="Georgia" w:cs="Georgia" w:eastAsia="Yu Gothic"/>
+                <w:b w:val="0"/>
+                <w:i/>
+                <w:sz w:val="19"/>
+              </w:rPr>
+              <w:t>(Yes) "Yes, I do. I can enjoy stories while doing other things. For example, I listen to English stories on the train to school."</w:t>
+            </w:r>
+          </w:p>
+        </w:tc>
+      </w:tr>
+    </w:tbl>
+    <w:p>
+      <w:r>
+        <w:br w:type="page"/>
+      </w:r>
+    </w:p>
+    <w:tbl>
+      <w:tblPr>
+        <w:tblW w:type="pct" w:w="5000"/>
+        <w:tblLook w:firstColumn="1" w:firstRow="1" w:lastColumn="0" w:lastRow="0" w:noHBand="0" w:noVBand="1" w:val="04A0"/>
+      </w:tblPr>
+      <w:tblGrid>
+        <w:gridCol w:w="10092"/>
+      </w:tblGrid>
+      <w:tr>
+        <w:tc>
+          <w:tcPr>
+            <w:tcW w:type="dxa" w:w="10092"/>
+            <w:tcBorders>
+              <w:top w:val="single" w:sz="14" w:space="0" w:color="185FA5"/>
+              <w:bottom w:val="single" w:sz="14" w:space="0" w:color="185FA5"/>
+              <w:left w:val="single" w:sz="14" w:space="0" w:color="185FA5"/>
+              <w:right w:val="single" w:sz="14" w:space="0" w:color="185FA5"/>
+            </w:tcBorders>
+          </w:tcPr>
+          <w:p>
+            <w:pPr>
+              <w:spacing w:before="40" w:after="80"/>
+            </w:pPr>
+            <w:r>
+              <w:rPr>
+                <w:rFonts w:ascii="Calibri" w:hAnsi="Calibri" w:cs="Calibri" w:eastAsia="Yu Gothic"/>
+                <w:b/>
+                <w:i w:val="0"/>
+                <w:color w:val="185FA5"/>
+                <w:sz w:val="21"/>
+              </w:rPr>
+              <w:t>PROBLEM CARD C</w:t>
+            </w:r>
+          </w:p>
+          <w:p>
+            <w:pPr>
+              <w:spacing w:before="40" w:after="40"/>
+            </w:pPr>
+            <w:r>
+              <w:rPr>
+                <w:rFonts w:ascii="Calibri" w:hAnsi="Calibri" w:cs="Calibri" w:eastAsia="Yu Gothic"/>
+                <w:b/>
+                <w:i w:val="0"/>
+                <w:color w:val="185FA5"/>
+                <w:sz w:val="20"/>
+              </w:rPr>
+              <w:t>Passage — "Cleaning the Park"</w:t>
+            </w:r>
+          </w:p>
+          <w:p>
+            <w:pPr>
+              <w:spacing w:before="40" w:after="80"/>
+              <w:shd w:val="clear" w:color="auto" w:fill="FBFCFD"/>
+            </w:pPr>
+            <w:r>
+              <w:rPr>
+                <w:rFonts w:ascii="Georgia" w:hAnsi="Georgia" w:cs="Georgia" w:eastAsia="Yu Gothic"/>
+                <w:b w:val="0"/>
+                <w:i w:val="0"/>
+                <w:sz w:val="22"/>
+              </w:rPr>
+              <w:t>In many towns, people work together to keep their parks clean. On weekends, some people join volunteer events and pick up trash in the park. By doing this, they can make the park safer and more beautiful for everyone. Children also learn that taking care of nature is important. Thanks to these events, more people now enjoy spending time outside.</w:t>
+            </w:r>
+          </w:p>
+          <w:p>
+            <w:pPr>
+              <w:spacing w:before="40" w:after="60"/>
+              <w:shd w:val="clear" w:color="auto" w:fill="E6F1FB"/>
+            </w:pPr>
+            <w:r>
+              <w:rPr>
+                <w:rFonts w:ascii="Georgia" w:hAnsi="Georgia" w:cs="Georgia" w:eastAsia="Yu Gothic"/>
+                <w:b/>
+                <w:i w:val="0"/>
+                <w:sz w:val="22"/>
+              </w:rPr>
+              <w:t>"One Sunday, Kenta saw a poster about a park clean-up event."</w:t>
+            </w:r>
+            <w:r>
+              <w:rPr>
+                <w:rFonts w:ascii="Calibri" w:hAnsi="Calibri" w:cs="Calibri" w:eastAsia="Yu Gothic"/>
+                <w:b w:val="0"/>
+                <w:i w:val="0"/>
+                <w:color w:val="5F6368"/>
+                <w:sz w:val="17"/>
+              </w:rPr>
+              <w:t xml:space="preserve">   (first sentence on the card)</w:t>
+            </w:r>
+          </w:p>
+          <w:p>
+            <w:pPr>
+              <w:spacing w:before="20" w:after="20"/>
+            </w:pPr>
+            <w:r>
+              <w:rPr>
+                <w:rFonts w:ascii="Calibri" w:hAnsi="Calibri" w:cs="Calibri" w:eastAsia="Yu Gothic"/>
+                <w:b/>
+                <w:i w:val="0"/>
+                <w:color w:val="185FA5"/>
+                <w:sz w:val="19"/>
+              </w:rPr>
+              <w:t xml:space="preserve">P1  </w:t>
+            </w:r>
+            <w:r>
+              <w:rPr>
+                <w:rFonts w:ascii="Calibri" w:hAnsi="Calibri" w:cs="Calibri" w:eastAsia="Yu Gothic"/>
+                <w:b w:val="0"/>
+                <w:i w:val="0"/>
+                <w:sz w:val="19"/>
+              </w:rPr>
+              <w:t>Kenta is reading a poster on the wall about a clean-up event. He looks interested.</w:t>
+            </w:r>
+          </w:p>
+          <w:p>
+            <w:pPr>
+              <w:spacing w:before="20" w:after="20"/>
+            </w:pPr>
+            <w:r>
+              <w:rPr>
+                <w:rFonts w:ascii="Calibri" w:hAnsi="Calibri" w:cs="Calibri" w:eastAsia="Yu Gothic"/>
+                <w:b/>
+                <w:i w:val="0"/>
+                <w:color w:val="185FA5"/>
+                <w:sz w:val="19"/>
+              </w:rPr>
+              <w:t xml:space="preserve">P2  </w:t>
+            </w:r>
+            <w:r>
+              <w:rPr>
+                <w:rFonts w:ascii="Calibri" w:hAnsi="Calibri" w:cs="Calibri" w:eastAsia="Yu Gothic"/>
+                <w:b w:val="0"/>
+                <w:i w:val="0"/>
+                <w:sz w:val="19"/>
+              </w:rPr>
+              <w:t>"The next weekend" — Kenta is picking up trash in the park with many other volunteers.</w:t>
+            </w:r>
+          </w:p>
+          <w:p>
+            <w:pPr>
+              <w:spacing w:before="20" w:after="20"/>
+            </w:pPr>
+            <w:r>
+              <w:rPr>
+                <w:rFonts w:ascii="Calibri" w:hAnsi="Calibri" w:cs="Calibri" w:eastAsia="Yu Gothic"/>
+                <w:b/>
+                <w:i w:val="0"/>
+                <w:color w:val="185FA5"/>
+                <w:sz w:val="19"/>
+              </w:rPr>
+              <w:t xml:space="preserve">P3  </w:t>
+            </w:r>
+            <w:r>
+              <w:rPr>
+                <w:rFonts w:ascii="Calibri" w:hAnsi="Calibri" w:cs="Calibri" w:eastAsia="Yu Gothic"/>
+                <w:b w:val="0"/>
+                <w:i w:val="0"/>
+                <w:sz w:val="19"/>
+              </w:rPr>
+              <w:t>"After the event" — the park looks clean and beautiful, and Kenta feels proud.</w:t>
+            </w:r>
+          </w:p>
+        </w:tc>
+      </w:tr>
+    </w:tbl>
+    <w:p>
+      <w:pPr>
+        <w:spacing w:after="40"/>
+      </w:pPr>
+    </w:p>
+    <w:p>
+      <w:pPr>
+        <w:spacing w:before="60" w:after="40"/>
+        <w:pBdr>
+          <w:left w:val="single" w:sz="20" w:space="8" w:color="185FA5"/>
+        </w:pBdr>
+        <w:ind w:left="200"/>
+      </w:pPr>
+      <w:r>
+        <w:rPr>
+          <w:rFonts w:ascii="Calibri" w:hAnsi="Calibri" w:cs="Calibri" w:eastAsia="Yu Gothic"/>
+          <w:b/>
+          <w:i w:val="0"/>
+          <w:color w:val="185FA5"/>
+          <w:sz w:val="20"/>
+        </w:rPr>
+        <w:t xml:space="preserve">No.1:  </w:t>
+      </w:r>
+      <w:r>
+        <w:rPr>
+          <w:rFonts w:ascii="Calibri" w:hAnsi="Calibri" w:cs="Calibri" w:eastAsia="Yu Gothic"/>
+          <w:b w:val="0"/>
+          <w:i w:val="0"/>
+          <w:sz w:val="20"/>
+        </w:rPr>
+        <w:t>According to the passage, how do some people make the park safer and more beautiful?</w:t>
+      </w:r>
+    </w:p>
+    <w:tbl>
+      <w:tblPr>
+        <w:tblW w:type="pct" w:w="5000"/>
+        <w:tblLook w:firstColumn="1" w:firstRow="1" w:lastColumn="0" w:lastRow="0" w:noHBand="0" w:noVBand="1" w:val="04A0"/>
+      </w:tblPr>
+      <w:tblGrid>
+        <w:gridCol w:w="10092"/>
+      </w:tblGrid>
+      <w:tr>
+        <w:tc>
+          <w:tcPr>
+            <w:tcW w:type="dxa" w:w="10092"/>
+            <w:shd w:val="clear" w:color="auto" w:fill="E1F5EE"/>
+            <w:tcBorders>
+              <w:top w:val="single" w:sz="6" w:space="0" w:color="B9E3D4"/>
+              <w:bottom w:val="single" w:sz="6" w:space="0" w:color="B9E3D4"/>
+              <w:left w:val="single" w:sz="6" w:space="0" w:color="B9E3D4"/>
+              <w:right w:val="single" w:sz="6" w:space="0" w:color="B9E3D4"/>
+            </w:tcBorders>
+          </w:tcPr>
+          <w:p>
+            <w:pPr>
+              <w:spacing w:before="40" w:after="40"/>
+            </w:pPr>
+            <w:r>
+              <w:rPr>
+                <w:rFonts w:ascii="Calibri" w:hAnsi="Calibri" w:cs="Calibri" w:eastAsia="Yu Gothic"/>
+                <w:b/>
+                <w:i w:val="0"/>
+                <w:color w:val="0F6E56"/>
+                <w:sz w:val="19"/>
+              </w:rPr>
+              <w:t xml:space="preserve">➤ Model: </w:t>
+            </w:r>
+            <w:r>
+              <w:rPr>
+                <w:rFonts w:ascii="Georgia" w:hAnsi="Georgia" w:cs="Georgia" w:eastAsia="Yu Gothic"/>
+                <w:b w:val="0"/>
+                <w:i/>
+                <w:sz w:val="19"/>
+              </w:rPr>
+              <w:t>"By joining volunteer events and picking up trash in the park."</w:t>
+            </w:r>
+          </w:p>
+        </w:tc>
+      </w:tr>
+    </w:tbl>
+    <w:p>
+      <w:pPr>
+        <w:spacing w:before="60" w:after="40"/>
+        <w:pBdr>
+          <w:left w:val="single" w:sz="20" w:space="8" w:color="185FA5"/>
+        </w:pBdr>
+        <w:ind w:left="200"/>
+      </w:pPr>
+      <w:r>
+        <w:rPr>
+          <w:rFonts w:ascii="Calibri" w:hAnsi="Calibri" w:cs="Calibri" w:eastAsia="Yu Gothic"/>
+          <w:b/>
+          <w:i w:val="0"/>
+          <w:color w:val="185FA5"/>
+          <w:sz w:val="20"/>
+        </w:rPr>
+        <w:t xml:space="preserve">No.2 (Narration):  </w:t>
+      </w:r>
+      <w:r>
+        <w:rPr>
+          <w:rFonts w:ascii="Calibri" w:hAnsi="Calibri" w:cs="Calibri" w:eastAsia="Yu Gothic"/>
+          <w:b w:val="0"/>
+          <w:i w:val="0"/>
+          <w:sz w:val="20"/>
+        </w:rPr>
+        <w:t>Begin with the sentence on the card.</w:t>
+      </w:r>
+    </w:p>
+    <w:tbl>
+      <w:tblPr>
+        <w:tblW w:type="pct" w:w="5000"/>
+        <w:tblLook w:firstColumn="1" w:firstRow="1" w:lastColumn="0" w:lastRow="0" w:noHBand="0" w:noVBand="1" w:val="04A0"/>
+      </w:tblPr>
+      <w:tblGrid>
+        <w:gridCol w:w="10092"/>
+      </w:tblGrid>
+      <w:tr>
+        <w:tc>
+          <w:tcPr>
+            <w:tcW w:type="dxa" w:w="10092"/>
+            <w:shd w:val="clear" w:color="auto" w:fill="E1F5EE"/>
+            <w:tcBorders>
+              <w:top w:val="single" w:sz="6" w:space="0" w:color="B9E3D4"/>
+              <w:bottom w:val="single" w:sz="6" w:space="0" w:color="B9E3D4"/>
+              <w:left w:val="single" w:sz="6" w:space="0" w:color="B9E3D4"/>
+              <w:right w:val="single" w:sz="6" w:space="0" w:color="B9E3D4"/>
+            </w:tcBorders>
+          </w:tcPr>
+          <w:p>
+            <w:pPr>
+              <w:spacing w:before="40" w:after="40"/>
+            </w:pPr>
+            <w:r>
+              <w:rPr>
+                <w:rFonts w:ascii="Calibri" w:hAnsi="Calibri" w:cs="Calibri" w:eastAsia="Yu Gothic"/>
+                <w:b/>
+                <w:i w:val="0"/>
+                <w:color w:val="0F6E56"/>
+                <w:sz w:val="19"/>
+              </w:rPr>
+              <w:t xml:space="preserve">➤ Model: </w:t>
+            </w:r>
+            <w:r>
+              <w:rPr>
+                <w:rFonts w:ascii="Georgia" w:hAnsi="Georgia" w:cs="Georgia" w:eastAsia="Yu Gothic"/>
+                <w:b w:val="0"/>
+                <w:i/>
+                <w:sz w:val="19"/>
+              </w:rPr>
+              <w:t>"One Sunday, Kenta saw a poster about a park clean-up event. He was interested, so he decided to join. The next weekend, Kenta was picking up trash in the park with many other volunteers, and everyone was working hard together. After the event, the park looked clean and beautiful, so Kenta felt very proud."</w:t>
+            </w:r>
+          </w:p>
+        </w:tc>
+      </w:tr>
+    </w:tbl>
+    <w:p>
+      <w:pPr>
+        <w:spacing w:before="60" w:after="40"/>
+        <w:pBdr>
+          <w:left w:val="single" w:sz="20" w:space="8" w:color="185FA5"/>
+        </w:pBdr>
+        <w:ind w:left="200"/>
+      </w:pPr>
+      <w:r>
+        <w:rPr>
+          <w:rFonts w:ascii="Calibri" w:hAnsi="Calibri" w:cs="Calibri" w:eastAsia="Yu Gothic"/>
+          <w:b/>
+          <w:i w:val="0"/>
+          <w:color w:val="185FA5"/>
+          <w:sz w:val="20"/>
+        </w:rPr>
+        <w:t xml:space="preserve">No.3:  </w:t>
+      </w:r>
+      <w:r>
+        <w:rPr>
+          <w:rFonts w:ascii="Calibri" w:hAnsi="Calibri" w:cs="Calibri" w:eastAsia="Yu Gothic"/>
+          <w:b w:val="0"/>
+          <w:i w:val="0"/>
+          <w:sz w:val="20"/>
+        </w:rPr>
+        <w:t>Do you think more young people will join volunteer activities in the future?</w:t>
+      </w:r>
+      <w:r>
+        <w:rPr>
+          <w:rFonts w:ascii="Calibri" w:hAnsi="Calibri" w:cs="Calibri" w:eastAsia="Yu Gothic"/>
+          <w:b w:val="0"/>
+          <w:i/>
+          <w:color w:val="5F6368"/>
+          <w:sz w:val="18"/>
+        </w:rPr>
+        <w:t xml:space="preserve">  [Yes → Why? / No → Why not?]</w:t>
+      </w:r>
+    </w:p>
+    <w:tbl>
+      <w:tblPr>
+        <w:tblW w:type="pct" w:w="5000"/>
+        <w:tblLook w:firstColumn="1" w:firstRow="1" w:lastColumn="0" w:lastRow="0" w:noHBand="0" w:noVBand="1" w:val="04A0"/>
+      </w:tblPr>
+      <w:tblGrid>
+        <w:gridCol w:w="10092"/>
+      </w:tblGrid>
+      <w:tr>
+        <w:tc>
+          <w:tcPr>
+            <w:tcW w:type="dxa" w:w="10092"/>
+            <w:shd w:val="clear" w:color="auto" w:fill="E1F5EE"/>
+            <w:tcBorders>
+              <w:top w:val="single" w:sz="6" w:space="0" w:color="B9E3D4"/>
+              <w:bottom w:val="single" w:sz="6" w:space="0" w:color="B9E3D4"/>
+              <w:left w:val="single" w:sz="6" w:space="0" w:color="B9E3D4"/>
+              <w:right w:val="single" w:sz="6" w:space="0" w:color="B9E3D4"/>
+            </w:tcBorders>
+          </w:tcPr>
+          <w:p>
+            <w:pPr>
+              <w:spacing w:before="40" w:after="40"/>
+            </w:pPr>
+            <w:r>
+              <w:rPr>
+                <w:rFonts w:ascii="Calibri" w:hAnsi="Calibri" w:cs="Calibri" w:eastAsia="Yu Gothic"/>
+                <w:b/>
+                <w:i w:val="0"/>
+                <w:color w:val="0F6E56"/>
+                <w:sz w:val="19"/>
+              </w:rPr>
+              <w:t xml:space="preserve">➤ Model: </w:t>
+            </w:r>
+            <w:r>
+              <w:rPr>
+                <w:rFonts w:ascii="Georgia" w:hAnsi="Georgia" w:cs="Georgia" w:eastAsia="Yu Gothic"/>
+                <w:b w:val="0"/>
+                <w:i/>
+                <w:sz w:val="19"/>
+              </w:rPr>
+              <w:t>(Yes) "Yes, I do. Many young people want to help their community, and joining events is a good way to make friends. Schools also tell students about volunteer work, so more of them will take part."</w:t>
+            </w:r>
+          </w:p>
+        </w:tc>
+      </w:tr>
+    </w:tbl>
+    <w:p>
+      <w:pPr>
+        <w:spacing w:before="60" w:after="40"/>
+        <w:pBdr>
+          <w:left w:val="single" w:sz="20" w:space="8" w:color="185FA5"/>
+        </w:pBdr>
+        <w:ind w:left="200"/>
+      </w:pPr>
+      <w:r>
+        <w:rPr>
+          <w:rFonts w:ascii="Calibri" w:hAnsi="Calibri" w:cs="Calibri" w:eastAsia="Yu Gothic"/>
+          <w:b/>
+          <w:i w:val="0"/>
+          <w:color w:val="185FA5"/>
+          <w:sz w:val="20"/>
+        </w:rPr>
+        <w:t xml:space="preserve">No.4:  </w:t>
+      </w:r>
+      <w:r>
+        <w:rPr>
+          <w:rFonts w:ascii="Calibri" w:hAnsi="Calibri" w:cs="Calibri" w:eastAsia="Yu Gothic"/>
+          <w:b w:val="0"/>
+          <w:i w:val="0"/>
+          <w:sz w:val="20"/>
+        </w:rPr>
+        <w:t>Today, many people enjoy spending time in parks. Do you like going to parks?</w:t>
+      </w:r>
+      <w:r>
+        <w:rPr>
+          <w:rFonts w:ascii="Calibri" w:hAnsi="Calibri" w:cs="Calibri" w:eastAsia="Yu Gothic"/>
+          <w:b w:val="0"/>
+          <w:i/>
+          <w:color w:val="5F6368"/>
+          <w:sz w:val="18"/>
+        </w:rPr>
+        <w:t xml:space="preserve">  [Yes → tell me more / No → Why not?]</w:t>
+      </w:r>
+    </w:p>
+    <w:tbl>
+      <w:tblPr>
+        <w:tblW w:type="pct" w:w="5000"/>
+        <w:tblLook w:firstColumn="1" w:firstRow="1" w:lastColumn="0" w:lastRow="0" w:noHBand="0" w:noVBand="1" w:val="04A0"/>
+      </w:tblPr>
+      <w:tblGrid>
+        <w:gridCol w:w="10092"/>
+      </w:tblGrid>
+      <w:tr>
+        <w:tc>
+          <w:tcPr>
+            <w:tcW w:type="dxa" w:w="10092"/>
+            <w:shd w:val="clear" w:color="auto" w:fill="E1F5EE"/>
+            <w:tcBorders>
+              <w:top w:val="single" w:sz="6" w:space="0" w:color="B9E3D4"/>
+              <w:bottom w:val="single" w:sz="6" w:space="0" w:color="B9E3D4"/>
+              <w:left w:val="single" w:sz="6" w:space="0" w:color="B9E3D4"/>
+              <w:right w:val="single" w:sz="6" w:space="0" w:color="B9E3D4"/>
+            </w:tcBorders>
+          </w:tcPr>
+          <w:p>
+            <w:pPr>
+              <w:spacing w:before="40" w:after="40"/>
+            </w:pPr>
+            <w:r>
+              <w:rPr>
+                <w:rFonts w:ascii="Calibri" w:hAnsi="Calibri" w:cs="Calibri" w:eastAsia="Yu Gothic"/>
+                <w:b/>
+                <w:i w:val="0"/>
+                <w:color w:val="0F6E56"/>
+                <w:sz w:val="19"/>
+              </w:rPr>
+              <w:t xml:space="preserve">➤ Model: </w:t>
+            </w:r>
+            <w:r>
+              <w:rPr>
+                <w:rFonts w:ascii="Georgia" w:hAnsi="Georgia" w:cs="Georgia" w:eastAsia="Yu Gothic"/>
+                <w:b w:val="0"/>
+                <w:i/>
+                <w:sz w:val="19"/>
+              </w:rPr>
+              <w:t>(Yes) "Yes, I do. Parks are good places to relax and exercise. For example, I often walk my dog or play sports in the park near my house."</w:t>
+            </w:r>
+          </w:p>
+        </w:tc>
+      </w:tr>
+    </w:tbl>
+    <w:p>
+      <w:r>
+        <w:br w:type="page"/>
+      </w:r>
+    </w:p>
+    <w:tbl>
+      <w:tblPr>
+        <w:tblW w:type="pct" w:w="5000"/>
+        <w:tblLook w:firstColumn="1" w:firstRow="1" w:lastColumn="0" w:lastRow="0" w:noHBand="0" w:noVBand="1" w:val="04A0"/>
+      </w:tblPr>
+      <w:tblGrid>
+        <w:gridCol w:w="10092"/>
+      </w:tblGrid>
+      <w:tr>
+        <w:tc>
+          <w:tcPr>
+            <w:tcW w:type="dxa" w:w="10092"/>
+            <w:tcBorders>
+              <w:top w:val="single" w:sz="14" w:space="0" w:color="9A6B00"/>
+              <w:bottom w:val="single" w:sz="14" w:space="0" w:color="9A6B00"/>
+              <w:left w:val="single" w:sz="14" w:space="0" w:color="9A6B00"/>
+              <w:right w:val="single" w:sz="14" w:space="0" w:color="9A6B00"/>
+            </w:tcBorders>
+          </w:tcPr>
+          <w:p>
+            <w:pPr>
+              <w:spacing w:before="40" w:after="80"/>
+            </w:pPr>
+            <w:r>
+              <w:rPr>
+                <w:rFonts w:ascii="Calibri" w:hAnsi="Calibri" w:cs="Calibri" w:eastAsia="Yu Gothic"/>
+                <w:b/>
+                <w:i w:val="0"/>
+                <w:color w:val="9A6B00"/>
+                <w:sz w:val="21"/>
+              </w:rPr>
+              <w:t>PROBLEM CARD D</w:t>
+            </w:r>
+          </w:p>
+          <w:p>
+            <w:pPr>
+              <w:spacing w:before="40" w:after="40"/>
+            </w:pPr>
+            <w:r>
+              <w:rPr>
+                <w:rFonts w:ascii="Calibri" w:hAnsi="Calibri" w:cs="Calibri" w:eastAsia="Yu Gothic"/>
+                <w:b/>
+                <w:i w:val="0"/>
+                <w:color w:val="9A6B00"/>
+                <w:sz w:val="20"/>
+              </w:rPr>
+              <w:t>Passage — "Walking Every Day"</w:t>
+            </w:r>
+          </w:p>
+          <w:p>
+            <w:pPr>
+              <w:spacing w:before="40" w:after="80"/>
+              <w:shd w:val="clear" w:color="auto" w:fill="FBFCFD"/>
+            </w:pPr>
+            <w:r>
+              <w:rPr>
+                <w:rFonts w:ascii="Georgia" w:hAnsi="Georgia" w:cs="Georgia" w:eastAsia="Yu Gothic"/>
+                <w:b w:val="0"/>
+                <w:i w:val="0"/>
+                <w:sz w:val="22"/>
+              </w:rPr>
+              <w:t>These days, many people try to stay healthy by walking every day. Some people walk to school or work instead of taking the bus. Others use a smartphone app that counts their steps. By walking more, they can keep their bodies strong and feel less tired. Doctors say that even a short walk every day is good for our health.</w:t>
+            </w:r>
+          </w:p>
+          <w:p>
+            <w:pPr>
+              <w:spacing w:before="40" w:after="60"/>
+              <w:shd w:val="clear" w:color="auto" w:fill="FFF6DD"/>
+            </w:pPr>
+            <w:r>
+              <w:rPr>
+                <w:rFonts w:ascii="Georgia" w:hAnsi="Georgia" w:cs="Georgia" w:eastAsia="Yu Gothic"/>
+                <w:b/>
+                <w:i w:val="0"/>
+                <w:sz w:val="22"/>
+              </w:rPr>
+              <w:t>"One morning, Yuki decided to start walking to school."</w:t>
+            </w:r>
+            <w:r>
+              <w:rPr>
+                <w:rFonts w:ascii="Calibri" w:hAnsi="Calibri" w:cs="Calibri" w:eastAsia="Yu Gothic"/>
+                <w:b w:val="0"/>
+                <w:i w:val="0"/>
+                <w:color w:val="5F6368"/>
+                <w:sz w:val="17"/>
+              </w:rPr>
+              <w:t xml:space="preserve">   (first sentence on the card)</w:t>
+            </w:r>
+          </w:p>
+          <w:p>
+            <w:pPr>
+              <w:spacing w:before="20" w:after="20"/>
+            </w:pPr>
+            <w:r>
+              <w:rPr>
+                <w:rFonts w:ascii="Calibri" w:hAnsi="Calibri" w:cs="Calibri" w:eastAsia="Yu Gothic"/>
+                <w:b/>
+                <w:i w:val="0"/>
+                <w:color w:val="9A6B00"/>
+                <w:sz w:val="19"/>
+              </w:rPr>
+              <w:t xml:space="preserve">P1  </w:t>
+            </w:r>
+            <w:r>
+              <w:rPr>
+                <w:rFonts w:ascii="Calibri" w:hAnsi="Calibri" w:cs="Calibri" w:eastAsia="Yu Gothic"/>
+                <w:b w:val="0"/>
+                <w:i w:val="0"/>
+                <w:sz w:val="19"/>
+              </w:rPr>
+              <w:t>Yuki is at home putting on her shoes and checking a step-counter app. She decides to walk instead of taking the bus.</w:t>
+            </w:r>
+          </w:p>
+          <w:p>
+            <w:pPr>
+              <w:spacing w:before="20" w:after="20"/>
+            </w:pPr>
+            <w:r>
+              <w:rPr>
+                <w:rFonts w:ascii="Calibri" w:hAnsi="Calibri" w:cs="Calibri" w:eastAsia="Yu Gothic"/>
+                <w:b/>
+                <w:i w:val="0"/>
+                <w:color w:val="9A6B00"/>
+                <w:sz w:val="19"/>
+              </w:rPr>
+              <w:t xml:space="preserve">P2  </w:t>
+            </w:r>
+            <w:r>
+              <w:rPr>
+                <w:rFonts w:ascii="Calibri" w:hAnsi="Calibri" w:cs="Calibri" w:eastAsia="Yu Gothic"/>
+                <w:b w:val="0"/>
+                <w:i w:val="0"/>
+                <w:sz w:val="19"/>
+              </w:rPr>
+              <w:t>"Two weeks later" — Yuki is walking to school with her friend and looks full of energy.</w:t>
+            </w:r>
+          </w:p>
+          <w:p>
+            <w:pPr>
+              <w:spacing w:before="20" w:after="20"/>
+            </w:pPr>
+            <w:r>
+              <w:rPr>
+                <w:rFonts w:ascii="Calibri" w:hAnsi="Calibri" w:cs="Calibri" w:eastAsia="Yu Gothic"/>
+                <w:b/>
+                <w:i w:val="0"/>
+                <w:color w:val="9A6B00"/>
+                <w:sz w:val="19"/>
+              </w:rPr>
+              <w:t xml:space="preserve">P3  </w:t>
+            </w:r>
+            <w:r>
+              <w:rPr>
+                <w:rFonts w:ascii="Calibri" w:hAnsi="Calibri" w:cs="Calibri" w:eastAsia="Yu Gothic"/>
+                <w:b w:val="0"/>
+                <w:i w:val="0"/>
+                <w:sz w:val="19"/>
+              </w:rPr>
+              <w:t>"One month later" — Yuki is running fast on sports day and feels strong and healthy.</w:t>
+            </w:r>
+          </w:p>
+        </w:tc>
+      </w:tr>
+    </w:tbl>
+    <w:p>
+      <w:pPr>
+        <w:spacing w:after="40"/>
+      </w:pPr>
+    </w:p>
+    <w:p>
+      <w:pPr>
+        <w:spacing w:before="60" w:after="40"/>
+        <w:pBdr>
+          <w:left w:val="single" w:sz="20" w:space="8" w:color="9A6B00"/>
+        </w:pBdr>
+        <w:ind w:left="200"/>
+      </w:pPr>
+      <w:r>
+        <w:rPr>
+          <w:rFonts w:ascii="Calibri" w:hAnsi="Calibri" w:cs="Calibri" w:eastAsia="Yu Gothic"/>
+          <w:b/>
+          <w:i w:val="0"/>
+          <w:color w:val="9A6B00"/>
+          <w:sz w:val="20"/>
+        </w:rPr>
+        <w:t xml:space="preserve">No.1:  </w:t>
+      </w:r>
+      <w:r>
+        <w:rPr>
+          <w:rFonts w:ascii="Calibri" w:hAnsi="Calibri" w:cs="Calibri" w:eastAsia="Yu Gothic"/>
+          <w:b w:val="0"/>
+          <w:i w:val="0"/>
+          <w:sz w:val="20"/>
+        </w:rPr>
+        <w:t>According to the passage, how do some people keep their bodies strong?</w:t>
+      </w:r>
+    </w:p>
+    <w:tbl>
+      <w:tblPr>
+        <w:tblW w:type="pct" w:w="5000"/>
+        <w:tblLook w:firstColumn="1" w:firstRow="1" w:lastColumn="0" w:lastRow="0" w:noHBand="0" w:noVBand="1" w:val="04A0"/>
+      </w:tblPr>
+      <w:tblGrid>
+        <w:gridCol w:w="10092"/>
+      </w:tblGrid>
+      <w:tr>
+        <w:tc>
+          <w:tcPr>
+            <w:tcW w:type="dxa" w:w="10092"/>
+            <w:shd w:val="clear" w:color="auto" w:fill="E1F5EE"/>
+            <w:tcBorders>
+              <w:top w:val="single" w:sz="6" w:space="0" w:color="B9E3D4"/>
+              <w:bottom w:val="single" w:sz="6" w:space="0" w:color="B9E3D4"/>
+              <w:left w:val="single" w:sz="6" w:space="0" w:color="B9E3D4"/>
+              <w:right w:val="single" w:sz="6" w:space="0" w:color="B9E3D4"/>
+            </w:tcBorders>
+          </w:tcPr>
+          <w:p>
+            <w:pPr>
+              <w:spacing w:before="40" w:after="40"/>
+            </w:pPr>
+            <w:r>
+              <w:rPr>
+                <w:rFonts w:ascii="Calibri" w:hAnsi="Calibri" w:cs="Calibri" w:eastAsia="Yu Gothic"/>
+                <w:b/>
+                <w:i w:val="0"/>
+                <w:color w:val="0F6E56"/>
+                <w:sz w:val="19"/>
+              </w:rPr>
+              <w:t xml:space="preserve">➤ Model: </w:t>
+            </w:r>
+            <w:r>
+              <w:rPr>
+                <w:rFonts w:ascii="Georgia" w:hAnsi="Georgia" w:cs="Georgia" w:eastAsia="Yu Gothic"/>
+                <w:b w:val="0"/>
+                <w:i/>
+                <w:sz w:val="19"/>
+              </w:rPr>
+              <w:t>"By walking more every day."</w:t>
+            </w:r>
+          </w:p>
+        </w:tc>
+      </w:tr>
+    </w:tbl>
+    <w:p>
+      <w:pPr>
+        <w:spacing w:before="60" w:after="40"/>
+        <w:pBdr>
+          <w:left w:val="single" w:sz="20" w:space="8" w:color="9A6B00"/>
+        </w:pBdr>
+        <w:ind w:left="200"/>
+      </w:pPr>
+      <w:r>
+        <w:rPr>
+          <w:rFonts w:ascii="Calibri" w:hAnsi="Calibri" w:cs="Calibri" w:eastAsia="Yu Gothic"/>
+          <w:b/>
+          <w:i w:val="0"/>
+          <w:color w:val="9A6B00"/>
+          <w:sz w:val="20"/>
+        </w:rPr>
+        <w:t xml:space="preserve">No.2 (Narration):  </w:t>
+      </w:r>
+      <w:r>
+        <w:rPr>
+          <w:rFonts w:ascii="Calibri" w:hAnsi="Calibri" w:cs="Calibri" w:eastAsia="Yu Gothic"/>
+          <w:b w:val="0"/>
+          <w:i w:val="0"/>
+          <w:sz w:val="20"/>
+        </w:rPr>
+        <w:t>Begin with the sentence on the card.</w:t>
+      </w:r>
+    </w:p>
+    <w:tbl>
+      <w:tblPr>
+        <w:tblW w:type="pct" w:w="5000"/>
+        <w:tblLook w:firstColumn="1" w:firstRow="1" w:lastColumn="0" w:lastRow="0" w:noHBand="0" w:noVBand="1" w:val="04A0"/>
+      </w:tblPr>
+      <w:tblGrid>
+        <w:gridCol w:w="10092"/>
+      </w:tblGrid>
+      <w:tr>
+        <w:tc>
+          <w:tcPr>
+            <w:tcW w:type="dxa" w:w="10092"/>
+            <w:shd w:val="clear" w:color="auto" w:fill="E1F5EE"/>
+            <w:tcBorders>
+              <w:top w:val="single" w:sz="6" w:space="0" w:color="B9E3D4"/>
+              <w:bottom w:val="single" w:sz="6" w:space="0" w:color="B9E3D4"/>
+              <w:left w:val="single" w:sz="6" w:space="0" w:color="B9E3D4"/>
+              <w:right w:val="single" w:sz="6" w:space="0" w:color="B9E3D4"/>
+            </w:tcBorders>
+          </w:tcPr>
+          <w:p>
+            <w:pPr>
+              <w:spacing w:before="40" w:after="40"/>
+            </w:pPr>
+            <w:r>
+              <w:rPr>
+                <w:rFonts w:ascii="Calibri" w:hAnsi="Calibri" w:cs="Calibri" w:eastAsia="Yu Gothic"/>
+                <w:b/>
+                <w:i w:val="0"/>
+                <w:color w:val="0F6E56"/>
+                <w:sz w:val="19"/>
+              </w:rPr>
+              <w:t xml:space="preserve">➤ Model: </w:t>
+            </w:r>
+            <w:r>
+              <w:rPr>
+                <w:rFonts w:ascii="Georgia" w:hAnsi="Georgia" w:cs="Georgia" w:eastAsia="Yu Gothic"/>
+                <w:b w:val="0"/>
+                <w:i/>
+                <w:sz w:val="19"/>
+              </w:rPr>
+              <w:t>"One morning, Yuki decided to start walking to school instead of taking the bus, and she used an app to count her steps. Two weeks later, Yuki was walking to school with her friend every day, and she felt full of energy. One month later, Yuki was running fast on sports day, and she felt much stronger and healthier than before."</w:t>
+            </w:r>
+          </w:p>
+        </w:tc>
+      </w:tr>
+    </w:tbl>
+    <w:p>
+      <w:pPr>
+        <w:spacing w:before="60" w:after="40"/>
+        <w:pBdr>
+          <w:left w:val="single" w:sz="20" w:space="8" w:color="9A6B00"/>
+        </w:pBdr>
+        <w:ind w:left="200"/>
+      </w:pPr>
+      <w:r>
+        <w:rPr>
+          <w:rFonts w:ascii="Calibri" w:hAnsi="Calibri" w:cs="Calibri" w:eastAsia="Yu Gothic"/>
+          <w:b/>
+          <w:i w:val="0"/>
+          <w:color w:val="9A6B00"/>
+          <w:sz w:val="20"/>
+        </w:rPr>
+        <w:t xml:space="preserve">No.3:  </w:t>
+      </w:r>
+      <w:r>
+        <w:rPr>
+          <w:rFonts w:ascii="Calibri" w:hAnsi="Calibri" w:cs="Calibri" w:eastAsia="Yu Gothic"/>
+          <w:b w:val="0"/>
+          <w:i w:val="0"/>
+          <w:sz w:val="20"/>
+        </w:rPr>
+        <w:t>Do you think more people will use smartphone apps to stay healthy in the future?</w:t>
+      </w:r>
+      <w:r>
+        <w:rPr>
+          <w:rFonts w:ascii="Calibri" w:hAnsi="Calibri" w:cs="Calibri" w:eastAsia="Yu Gothic"/>
+          <w:b w:val="0"/>
+          <w:i/>
+          <w:color w:val="5F6368"/>
+          <w:sz w:val="18"/>
+        </w:rPr>
+        <w:t xml:space="preserve">  [Yes → Why? / No → Why not?]</w:t>
+      </w:r>
+    </w:p>
+    <w:tbl>
+      <w:tblPr>
+        <w:tblW w:type="pct" w:w="5000"/>
+        <w:tblLook w:firstColumn="1" w:firstRow="1" w:lastColumn="0" w:lastRow="0" w:noHBand="0" w:noVBand="1" w:val="04A0"/>
+      </w:tblPr>
+      <w:tblGrid>
+        <w:gridCol w:w="10092"/>
+      </w:tblGrid>
+      <w:tr>
+        <w:tc>
+          <w:tcPr>
+            <w:tcW w:type="dxa" w:w="10092"/>
+            <w:shd w:val="clear" w:color="auto" w:fill="E1F5EE"/>
+            <w:tcBorders>
+              <w:top w:val="single" w:sz="6" w:space="0" w:color="B9E3D4"/>
+              <w:bottom w:val="single" w:sz="6" w:space="0" w:color="B9E3D4"/>
+              <w:left w:val="single" w:sz="6" w:space="0" w:color="B9E3D4"/>
+              <w:right w:val="single" w:sz="6" w:space="0" w:color="B9E3D4"/>
+            </w:tcBorders>
+          </w:tcPr>
+          <w:p>
+            <w:pPr>
+              <w:spacing w:before="40" w:after="40"/>
+            </w:pPr>
+            <w:r>
+              <w:rPr>
+                <w:rFonts w:ascii="Calibri" w:hAnsi="Calibri" w:cs="Calibri" w:eastAsia="Yu Gothic"/>
+                <w:b/>
+                <w:i w:val="0"/>
+                <w:color w:val="0F6E56"/>
+                <w:sz w:val="19"/>
+              </w:rPr>
+              <w:t xml:space="preserve">➤ Model: </w:t>
+            </w:r>
+            <w:r>
+              <w:rPr>
+                <w:rFonts w:ascii="Georgia" w:hAnsi="Georgia" w:cs="Georgia" w:eastAsia="Yu Gothic"/>
+                <w:b w:val="0"/>
+                <w:i/>
+                <w:sz w:val="19"/>
+              </w:rPr>
+              <w:t>(Yes) "Yes, I do. Health apps are easy to use, and they help people check their bodies every day. New apps are also becoming more useful, so more people will use them."</w:t>
+            </w:r>
+          </w:p>
+        </w:tc>
+      </w:tr>
+    </w:tbl>
+    <w:p>
+      <w:pPr>
+        <w:spacing w:before="60" w:after="40"/>
+        <w:pBdr>
+          <w:left w:val="single" w:sz="20" w:space="8" w:color="9A6B00"/>
+        </w:pBdr>
+        <w:ind w:left="200"/>
+      </w:pPr>
+      <w:r>
+        <w:rPr>
+          <w:rFonts w:ascii="Calibri" w:hAnsi="Calibri" w:cs="Calibri" w:eastAsia="Yu Gothic"/>
+          <w:b/>
+          <w:i w:val="0"/>
+          <w:color w:val="9A6B00"/>
+          <w:sz w:val="20"/>
+        </w:rPr>
+        <w:t xml:space="preserve">No.4:  </w:t>
+      </w:r>
+      <w:r>
+        <w:rPr>
+          <w:rFonts w:ascii="Calibri" w:hAnsi="Calibri" w:cs="Calibri" w:eastAsia="Yu Gothic"/>
+          <w:b w:val="0"/>
+          <w:i w:val="0"/>
+          <w:sz w:val="20"/>
+        </w:rPr>
+        <w:t>Today, many people enjoy playing sports. Do you like playing sports?</w:t>
+      </w:r>
+      <w:r>
+        <w:rPr>
+          <w:rFonts w:ascii="Calibri" w:hAnsi="Calibri" w:cs="Calibri" w:eastAsia="Yu Gothic"/>
+          <w:b w:val="0"/>
+          <w:i/>
+          <w:color w:val="5F6368"/>
+          <w:sz w:val="18"/>
+        </w:rPr>
+        <w:t xml:space="preserve">  [Yes → tell me more / No → Why not?]</w:t>
+      </w:r>
+    </w:p>
+    <w:tbl>
+      <w:tblPr>
+        <w:tblW w:type="pct" w:w="5000"/>
+        <w:tblLook w:firstColumn="1" w:firstRow="1" w:lastColumn="0" w:lastRow="0" w:noHBand="0" w:noVBand="1" w:val="04A0"/>
+      </w:tblPr>
+      <w:tblGrid>
+        <w:gridCol w:w="10092"/>
+      </w:tblGrid>
+      <w:tr>
+        <w:tc>
+          <w:tcPr>
+            <w:tcW w:type="dxa" w:w="10092"/>
+            <w:shd w:val="clear" w:color="auto" w:fill="E1F5EE"/>
+            <w:tcBorders>
+              <w:top w:val="single" w:sz="6" w:space="0" w:color="B9E3D4"/>
+              <w:bottom w:val="single" w:sz="6" w:space="0" w:color="B9E3D4"/>
+              <w:left w:val="single" w:sz="6" w:space="0" w:color="B9E3D4"/>
+              <w:right w:val="single" w:sz="6" w:space="0" w:color="B9E3D4"/>
+            </w:tcBorders>
+          </w:tcPr>
+          <w:p>
+            <w:pPr>
+              <w:spacing w:before="40" w:after="40"/>
+            </w:pPr>
+            <w:r>
+              <w:rPr>
+                <w:rFonts w:ascii="Calibri" w:hAnsi="Calibri" w:cs="Calibri" w:eastAsia="Yu Gothic"/>
+                <w:b/>
+                <w:i w:val="0"/>
+                <w:color w:val="0F6E56"/>
+                <w:sz w:val="19"/>
+              </w:rPr>
+              <w:t xml:space="preserve">➤ Model: </w:t>
+            </w:r>
+            <w:r>
+              <w:rPr>
+                <w:rFonts w:ascii="Georgia" w:hAnsi="Georgia" w:cs="Georgia" w:eastAsia="Yu Gothic"/>
+                <w:b w:val="0"/>
+                <w:i/>
+                <w:sz w:val="19"/>
+              </w:rPr>
+              <w:t>(Yes) "Yes, I do. Playing sports is fun and good for my health. For example, I play badminton with my friends after school every week."</w:t>
+            </w:r>
+          </w:p>
+        </w:tc>
+      </w:tr>
+    </w:tbl>
+    <w:p>
+      <w:r>
+        <w:br w:type="page"/>
+      </w:r>
+    </w:p>
+    <w:tbl>
+      <w:tblPr>
+        <w:tblW w:type="pct" w:w="5000"/>
+        <w:tblLook w:firstColumn="1" w:firstRow="1" w:lastColumn="0" w:lastRow="0" w:noHBand="0" w:noVBand="1" w:val="04A0"/>
+      </w:tblPr>
+      <w:tblGrid>
+        <w:gridCol w:w="10092"/>
+      </w:tblGrid>
+      <w:tr>
+        <w:tc>
+          <w:tcPr>
+            <w:tcW w:type="dxa" w:w="10092"/>
+            <w:tcBorders>
+              <w:top w:val="single" w:sz="14" w:space="0" w:color="6A3FA0"/>
+              <w:bottom w:val="single" w:sz="14" w:space="0" w:color="6A3FA0"/>
+              <w:left w:val="single" w:sz="14" w:space="0" w:color="6A3FA0"/>
+              <w:right w:val="single" w:sz="14" w:space="0" w:color="6A3FA0"/>
+            </w:tcBorders>
+          </w:tcPr>
+          <w:p>
+            <w:pPr>
+              <w:spacing w:before="40" w:after="80"/>
+            </w:pPr>
+            <w:r>
+              <w:rPr>
+                <w:rFonts w:ascii="Calibri" w:hAnsi="Calibri" w:cs="Calibri" w:eastAsia="Yu Gothic"/>
+                <w:b/>
+                <w:i w:val="0"/>
+                <w:color w:val="6A3FA0"/>
+                <w:sz w:val="21"/>
+              </w:rPr>
+              <w:t>PROBLEM CARD E</w:t>
+            </w:r>
+          </w:p>
+          <w:p>
+            <w:pPr>
+              <w:spacing w:before="40" w:after="40"/>
+            </w:pPr>
+            <w:r>
+              <w:rPr>
+                <w:rFonts w:ascii="Calibri" w:hAnsi="Calibri" w:cs="Calibri" w:eastAsia="Yu Gothic"/>
+                <w:b/>
+                <w:i w:val="0"/>
+                <w:color w:val="6A3FA0"/>
+                <w:sz w:val="20"/>
+              </w:rPr>
+              <w:t>Passage — "Talking Online with Family"</w:t>
+            </w:r>
+          </w:p>
+          <w:p>
+            <w:pPr>
+              <w:spacing w:before="40" w:after="80"/>
+              <w:shd w:val="clear" w:color="auto" w:fill="FBFCFD"/>
+            </w:pPr>
+            <w:r>
+              <w:rPr>
+                <w:rFonts w:ascii="Georgia" w:hAnsi="Georgia" w:cs="Georgia" w:eastAsia="Yu Gothic"/>
+                <w:b w:val="0"/>
+                <w:i w:val="0"/>
+                <w:sz w:val="22"/>
+              </w:rPr>
+              <w:t>Today, many families use the internet to talk with relatives who live far away. With a smartphone or computer, they can see each other's faces and talk for free. By doing this, grandparents can watch their grandchildren grow up, even from another city. Some people also share photos online. Thanks to technology, families can stay close although they live apart.</w:t>
+            </w:r>
+          </w:p>
+          <w:p>
+            <w:pPr>
+              <w:spacing w:before="40" w:after="60"/>
+              <w:shd w:val="clear" w:color="auto" w:fill="EEE7F7"/>
+            </w:pPr>
+            <w:r>
+              <w:rPr>
+                <w:rFonts w:ascii="Georgia" w:hAnsi="Georgia" w:cs="Georgia" w:eastAsia="Yu Gothic"/>
+                <w:b/>
+                <w:i w:val="0"/>
+                <w:sz w:val="22"/>
+              </w:rPr>
+              <w:t>"One evening, Aya wanted to talk with her grandmother."</w:t>
+            </w:r>
+            <w:r>
+              <w:rPr>
+                <w:rFonts w:ascii="Calibri" w:hAnsi="Calibri" w:cs="Calibri" w:eastAsia="Yu Gothic"/>
+                <w:b w:val="0"/>
+                <w:i w:val="0"/>
+                <w:color w:val="5F6368"/>
+                <w:sz w:val="17"/>
+              </w:rPr>
+              <w:t xml:space="preserve">   (first sentence on the card)</w:t>
+            </w:r>
+          </w:p>
+          <w:p>
+            <w:pPr>
+              <w:spacing w:before="20" w:after="20"/>
+            </w:pPr>
+            <w:r>
+              <w:rPr>
+                <w:rFonts w:ascii="Calibri" w:hAnsi="Calibri" w:cs="Calibri" w:eastAsia="Yu Gothic"/>
+                <w:b/>
+                <w:i w:val="0"/>
+                <w:color w:val="6A3FA0"/>
+                <w:sz w:val="19"/>
+              </w:rPr>
+              <w:t xml:space="preserve">P1  </w:t>
+            </w:r>
+            <w:r>
+              <w:rPr>
+                <w:rFonts w:ascii="Calibri" w:hAnsi="Calibri" w:cs="Calibri" w:eastAsia="Yu Gothic"/>
+                <w:b w:val="0"/>
+                <w:i w:val="0"/>
+                <w:sz w:val="19"/>
+              </w:rPr>
+              <w:t>Aya is at home feeling a little lonely. She misses her grandmother, who lives far away, so she picks up a tablet to make a video call.</w:t>
+            </w:r>
+          </w:p>
+          <w:p>
+            <w:pPr>
+              <w:spacing w:before="20" w:after="20"/>
+            </w:pPr>
+            <w:r>
+              <w:rPr>
+                <w:rFonts w:ascii="Calibri" w:hAnsi="Calibri" w:cs="Calibri" w:eastAsia="Yu Gothic"/>
+                <w:b/>
+                <w:i w:val="0"/>
+                <w:color w:val="6A3FA0"/>
+                <w:sz w:val="19"/>
+              </w:rPr>
+              <w:t xml:space="preserve">P2  </w:t>
+            </w:r>
+            <w:r>
+              <w:rPr>
+                <w:rFonts w:ascii="Calibri" w:hAnsi="Calibri" w:cs="Calibri" w:eastAsia="Yu Gothic"/>
+                <w:b w:val="0"/>
+                <w:i w:val="0"/>
+                <w:sz w:val="19"/>
+              </w:rPr>
+              <w:t>"A few minutes later" — Aya is talking with her grandmother on the screen, and they are both smiling.</w:t>
+            </w:r>
+          </w:p>
+          <w:p>
+            <w:pPr>
+              <w:spacing w:before="20" w:after="20"/>
+            </w:pPr>
+            <w:r>
+              <w:rPr>
+                <w:rFonts w:ascii="Calibri" w:hAnsi="Calibri" w:cs="Calibri" w:eastAsia="Yu Gothic"/>
+                <w:b/>
+                <w:i w:val="0"/>
+                <w:color w:val="6A3FA0"/>
+                <w:sz w:val="19"/>
+              </w:rPr>
+              <w:t xml:space="preserve">P3  </w:t>
+            </w:r>
+            <w:r>
+              <w:rPr>
+                <w:rFonts w:ascii="Calibri" w:hAnsi="Calibri" w:cs="Calibri" w:eastAsia="Yu Gothic"/>
+                <w:b w:val="0"/>
+                <w:i w:val="0"/>
+                <w:sz w:val="19"/>
+              </w:rPr>
+              <w:t>"That weekend" — Aya shows her grandmother a picture she drew, and her grandmother looks very happy.</w:t>
+            </w:r>
+          </w:p>
+        </w:tc>
+      </w:tr>
+    </w:tbl>
+    <w:p>
+      <w:pPr>
+        <w:spacing w:after="40"/>
+      </w:pPr>
+    </w:p>
+    <w:p>
+      <w:pPr>
+        <w:spacing w:before="60" w:after="40"/>
+        <w:pBdr>
+          <w:left w:val="single" w:sz="20" w:space="8" w:color="6A3FA0"/>
+        </w:pBdr>
+        <w:ind w:left="200"/>
+      </w:pPr>
+      <w:r>
+        <w:rPr>
+          <w:rFonts w:ascii="Calibri" w:hAnsi="Calibri" w:cs="Calibri" w:eastAsia="Yu Gothic"/>
+          <w:b/>
+          <w:i w:val="0"/>
+          <w:color w:val="6A3FA0"/>
+          <w:sz w:val="20"/>
+        </w:rPr>
+        <w:t xml:space="preserve">No.1:  </w:t>
+      </w:r>
+      <w:r>
+        <w:rPr>
+          <w:rFonts w:ascii="Calibri" w:hAnsi="Calibri" w:cs="Calibri" w:eastAsia="Yu Gothic"/>
+          <w:b w:val="0"/>
+          <w:i w:val="0"/>
+          <w:sz w:val="20"/>
+        </w:rPr>
+        <w:t>According to the passage, how can grandparents watch their grandchildren grow up from another city?</w:t>
+      </w:r>
+    </w:p>
+    <w:tbl>
+      <w:tblPr>
+        <w:tblW w:type="pct" w:w="5000"/>
+        <w:tblLook w:firstColumn="1" w:firstRow="1" w:lastColumn="0" w:lastRow="0" w:noHBand="0" w:noVBand="1" w:val="04A0"/>
+      </w:tblPr>
+      <w:tblGrid>
+        <w:gridCol w:w="10092"/>
+      </w:tblGrid>
+      <w:tr>
+        <w:tc>
+          <w:tcPr>
+            <w:tcW w:type="dxa" w:w="10092"/>
+            <w:shd w:val="clear" w:color="auto" w:fill="E1F5EE"/>
+            <w:tcBorders>
+              <w:top w:val="single" w:sz="6" w:space="0" w:color="B9E3D4"/>
+              <w:bottom w:val="single" w:sz="6" w:space="0" w:color="B9E3D4"/>
+              <w:left w:val="single" w:sz="6" w:space="0" w:color="B9E3D4"/>
+              <w:right w:val="single" w:sz="6" w:space="0" w:color="B9E3D4"/>
+            </w:tcBorders>
+          </w:tcPr>
+          <w:p>
+            <w:pPr>
+              <w:spacing w:before="40" w:after="40"/>
+            </w:pPr>
+            <w:r>
+              <w:rPr>
+                <w:rFonts w:ascii="Calibri" w:hAnsi="Calibri" w:cs="Calibri" w:eastAsia="Yu Gothic"/>
+                <w:b/>
+                <w:i w:val="0"/>
+                <w:color w:val="0F6E56"/>
+                <w:sz w:val="19"/>
+              </w:rPr>
+              <w:t xml:space="preserve">➤ Model: </w:t>
+            </w:r>
+            <w:r>
+              <w:rPr>
+                <w:rFonts w:ascii="Georgia" w:hAnsi="Georgia" w:cs="Georgia" w:eastAsia="Yu Gothic"/>
+                <w:b w:val="0"/>
+                <w:i/>
+                <w:sz w:val="19"/>
+              </w:rPr>
+              <w:t>"By using a smartphone or computer to see each other's faces and talk."</w:t>
+            </w:r>
+          </w:p>
+        </w:tc>
+      </w:tr>
+    </w:tbl>
+    <w:p>
+      <w:pPr>
+        <w:spacing w:before="60" w:after="40"/>
+        <w:pBdr>
+          <w:left w:val="single" w:sz="20" w:space="8" w:color="6A3FA0"/>
+        </w:pBdr>
+        <w:ind w:left="200"/>
+      </w:pPr>
+      <w:r>
+        <w:rPr>
+          <w:rFonts w:ascii="Calibri" w:hAnsi="Calibri" w:cs="Calibri" w:eastAsia="Yu Gothic"/>
+          <w:b/>
+          <w:i w:val="0"/>
+          <w:color w:val="6A3FA0"/>
+          <w:sz w:val="20"/>
+        </w:rPr>
+        <w:t xml:space="preserve">No.2 (Narration):  </w:t>
+      </w:r>
+      <w:r>
+        <w:rPr>
+          <w:rFonts w:ascii="Calibri" w:hAnsi="Calibri" w:cs="Calibri" w:eastAsia="Yu Gothic"/>
+          <w:b w:val="0"/>
+          <w:i w:val="0"/>
+          <w:sz w:val="20"/>
+        </w:rPr>
+        <w:t>Begin with the sentence on the card.</w:t>
+      </w:r>
+    </w:p>
+    <w:tbl>
+      <w:tblPr>
+        <w:tblW w:type="pct" w:w="5000"/>
+        <w:tblLook w:firstColumn="1" w:firstRow="1" w:lastColumn="0" w:lastRow="0" w:noHBand="0" w:noVBand="1" w:val="04A0"/>
+      </w:tblPr>
+      <w:tblGrid>
+        <w:gridCol w:w="10092"/>
+      </w:tblGrid>
+      <w:tr>
+        <w:tc>
+          <w:tcPr>
+            <w:tcW w:type="dxa" w:w="10092"/>
+            <w:shd w:val="clear" w:color="auto" w:fill="E1F5EE"/>
+            <w:tcBorders>
+              <w:top w:val="single" w:sz="6" w:space="0" w:color="B9E3D4"/>
+              <w:bottom w:val="single" w:sz="6" w:space="0" w:color="B9E3D4"/>
+              <w:left w:val="single" w:sz="6" w:space="0" w:color="B9E3D4"/>
+              <w:right w:val="single" w:sz="6" w:space="0" w:color="B9E3D4"/>
+            </w:tcBorders>
+          </w:tcPr>
+          <w:p>
+            <w:pPr>
+              <w:spacing w:before="40" w:after="40"/>
+            </w:pPr>
+            <w:r>
+              <w:rPr>
+                <w:rFonts w:ascii="Calibri" w:hAnsi="Calibri" w:cs="Calibri" w:eastAsia="Yu Gothic"/>
+                <w:b/>
+                <w:i w:val="0"/>
+                <w:color w:val="0F6E56"/>
+                <w:sz w:val="19"/>
+              </w:rPr>
+              <w:t xml:space="preserve">➤ Model: </w:t>
+            </w:r>
+            <w:r>
+              <w:rPr>
+                <w:rFonts w:ascii="Georgia" w:hAnsi="Georgia" w:cs="Georgia" w:eastAsia="Yu Gothic"/>
+                <w:b w:val="0"/>
+                <w:i/>
+                <w:sz w:val="19"/>
+              </w:rPr>
+              <w:t>"One evening, Aya wanted to talk with her grandmother, who lived far away. She felt a little lonely, so she decided to make a video call. A few minutes later, Aya was talking with her grandmother on the screen, and they were both smiling. That weekend, Aya showed her grandmother a picture she drew, and her grandmother looked very happy."</w:t>
+            </w:r>
+          </w:p>
+        </w:tc>
+      </w:tr>
+    </w:tbl>
+    <w:p>
+      <w:pPr>
+        <w:spacing w:before="60" w:after="40"/>
+        <w:pBdr>
+          <w:left w:val="single" w:sz="20" w:space="8" w:color="6A3FA0"/>
+        </w:pBdr>
+        <w:ind w:left="200"/>
+      </w:pPr>
+      <w:r>
+        <w:rPr>
+          <w:rFonts w:ascii="Calibri" w:hAnsi="Calibri" w:cs="Calibri" w:eastAsia="Yu Gothic"/>
+          <w:b/>
+          <w:i w:val="0"/>
+          <w:color w:val="6A3FA0"/>
+          <w:sz w:val="20"/>
+        </w:rPr>
+        <w:t xml:space="preserve">No.3:  </w:t>
+      </w:r>
+      <w:r>
+        <w:rPr>
+          <w:rFonts w:ascii="Calibri" w:hAnsi="Calibri" w:cs="Calibri" w:eastAsia="Yu Gothic"/>
+          <w:b w:val="0"/>
+          <w:i w:val="0"/>
+          <w:sz w:val="20"/>
+        </w:rPr>
+        <w:t>Do you think more people will use the internet to talk with their families in the future?</w:t>
+      </w:r>
+      <w:r>
+        <w:rPr>
+          <w:rFonts w:ascii="Calibri" w:hAnsi="Calibri" w:cs="Calibri" w:eastAsia="Yu Gothic"/>
+          <w:b w:val="0"/>
+          <w:i/>
+          <w:color w:val="5F6368"/>
+          <w:sz w:val="18"/>
+        </w:rPr>
+        <w:t xml:space="preserve">  [Yes → Why? / No → Why not?]</w:t>
+      </w:r>
+    </w:p>
+    <w:tbl>
+      <w:tblPr>
+        <w:tblW w:type="pct" w:w="5000"/>
+        <w:tblLook w:firstColumn="1" w:firstRow="1" w:lastColumn="0" w:lastRow="0" w:noHBand="0" w:noVBand="1" w:val="04A0"/>
+      </w:tblPr>
+      <w:tblGrid>
+        <w:gridCol w:w="10092"/>
+      </w:tblGrid>
+      <w:tr>
+        <w:tc>
+          <w:tcPr>
+            <w:tcW w:type="dxa" w:w="10092"/>
+            <w:shd w:val="clear" w:color="auto" w:fill="E1F5EE"/>
+            <w:tcBorders>
+              <w:top w:val="single" w:sz="6" w:space="0" w:color="B9E3D4"/>
+              <w:bottom w:val="single" w:sz="6" w:space="0" w:color="B9E3D4"/>
+              <w:left w:val="single" w:sz="6" w:space="0" w:color="B9E3D4"/>
+              <w:right w:val="single" w:sz="6" w:space="0" w:color="B9E3D4"/>
+            </w:tcBorders>
+          </w:tcPr>
+          <w:p>
+            <w:pPr>
+              <w:spacing w:before="40" w:after="40"/>
+            </w:pPr>
+            <w:r>
+              <w:rPr>
+                <w:rFonts w:ascii="Calibri" w:hAnsi="Calibri" w:cs="Calibri" w:eastAsia="Yu Gothic"/>
+                <w:b/>
+                <w:i w:val="0"/>
+                <w:color w:val="0F6E56"/>
+                <w:sz w:val="19"/>
+              </w:rPr>
+              <w:t xml:space="preserve">➤ Model: </w:t>
+            </w:r>
+            <w:r>
+              <w:rPr>
+                <w:rFonts w:ascii="Georgia" w:hAnsi="Georgia" w:cs="Georgia" w:eastAsia="Yu Gothic"/>
+                <w:b w:val="0"/>
+                <w:i/>
+                <w:sz w:val="19"/>
+              </w:rPr>
+              <w:t>(Yes) "Yes, I do. The internet makes it easy to talk with people far away, and it is free. Also, more older people are learning to use smartphones, so more families will talk online."</w:t>
+            </w:r>
+          </w:p>
+        </w:tc>
+      </w:tr>
+    </w:tbl>
+    <w:p>
+      <w:pPr>
+        <w:spacing w:before="60" w:after="40"/>
+        <w:pBdr>
+          <w:left w:val="single" w:sz="20" w:space="8" w:color="6A3FA0"/>
+        </w:pBdr>
+        <w:ind w:left="200"/>
+      </w:pPr>
+      <w:r>
+        <w:rPr>
+          <w:rFonts w:ascii="Calibri" w:hAnsi="Calibri" w:cs="Calibri" w:eastAsia="Yu Gothic"/>
+          <w:b/>
+          <w:i w:val="0"/>
+          <w:color w:val="6A3FA0"/>
+          <w:sz w:val="20"/>
+        </w:rPr>
+        <w:t xml:space="preserve">No.4:  </w:t>
+      </w:r>
+      <w:r>
+        <w:rPr>
+          <w:rFonts w:ascii="Calibri" w:hAnsi="Calibri" w:cs="Calibri" w:eastAsia="Yu Gothic"/>
+          <w:b w:val="0"/>
+          <w:i w:val="0"/>
+          <w:sz w:val="20"/>
+        </w:rPr>
+        <w:t>Today, many people use the internet every day. Do you often use the internet?</w:t>
+      </w:r>
+      <w:r>
+        <w:rPr>
+          <w:rFonts w:ascii="Calibri" w:hAnsi="Calibri" w:cs="Calibri" w:eastAsia="Yu Gothic"/>
+          <w:b w:val="0"/>
+          <w:i/>
+          <w:color w:val="5F6368"/>
+          <w:sz w:val="18"/>
+        </w:rPr>
+        <w:t xml:space="preserve">  [Yes → tell me more / No → Why not?]</w:t>
+      </w:r>
+    </w:p>
+    <w:tbl>
+      <w:tblPr>
+        <w:tblW w:type="pct" w:w="5000"/>
+        <w:tblLook w:firstColumn="1" w:firstRow="1" w:lastColumn="0" w:lastRow="0" w:noHBand="0" w:noVBand="1" w:val="04A0"/>
+      </w:tblPr>
+      <w:tblGrid>
+        <w:gridCol w:w="10092"/>
+      </w:tblGrid>
+      <w:tr>
+        <w:tc>
+          <w:tcPr>
+            <w:tcW w:type="dxa" w:w="10092"/>
+            <w:shd w:val="clear" w:color="auto" w:fill="E1F5EE"/>
+            <w:tcBorders>
+              <w:top w:val="single" w:sz="6" w:space="0" w:color="B9E3D4"/>
+              <w:bottom w:val="single" w:sz="6" w:space="0" w:color="B9E3D4"/>
+              <w:left w:val="single" w:sz="6" w:space="0" w:color="B9E3D4"/>
+              <w:right w:val="single" w:sz="6" w:space="0" w:color="B9E3D4"/>
+            </w:tcBorders>
+          </w:tcPr>
+          <w:p>
+            <w:pPr>
+              <w:spacing w:before="40" w:after="40"/>
+            </w:pPr>
+            <w:r>
+              <w:rPr>
+                <w:rFonts w:ascii="Calibri" w:hAnsi="Calibri" w:cs="Calibri" w:eastAsia="Yu Gothic"/>
+                <w:b/>
+                <w:i w:val="0"/>
+                <w:color w:val="0F6E56"/>
+                <w:sz w:val="19"/>
+              </w:rPr>
+              <w:t xml:space="preserve">➤ Model: </w:t>
+            </w:r>
+            <w:r>
+              <w:rPr>
+                <w:rFonts w:ascii="Georgia" w:hAnsi="Georgia" w:cs="Georgia" w:eastAsia="Yu Gothic"/>
+                <w:b w:val="0"/>
+                <w:i/>
+                <w:sz w:val="19"/>
+              </w:rPr>
+              <w:t>(Yes) "Yes, I do. I use it to study and to talk with my friends. For example, I often watch English videos online to practice listening."</w:t>
+            </w:r>
+          </w:p>
+        </w:tc>
+      </w:tr>
+    </w:tbl>
     <w:p>
       <w:pPr>
         <w:spacing w:before="200" w:after="0"/>

</xml_diff>